<commit_message>
Minor fix of industrial cv
</commit_message>
<xml_diff>
--- a/cv_industry.docx
+++ b/cv_industry.docx
@@ -1024,6 +1024,70 @@
     </w:p>
     <w:p>
       <w:pPr>
+        <w:keepNext/>
+        <w:tabs>
+          <w:tab w:val="right" w:pos="9866"/>
+        </w:tabs>
+        <w:spacing w:before="100"/>
+      </w:pPr>
+      <w:r>
+        <w:rPr>
+          <w:b/>
+          <w:sz w:val="20"/>
+        </w:rPr>
+        <w:t>Doctoral Researcher</w:t>
+      </w:r>
+      <w:r>
+        <w:rPr>
+          <w:sz w:val="20"/>
+        </w:rPr>
+        <w:t xml:space="preserve">  ·  COSIC, KU Leuven</w:t>
+      </w:r>
+      <w:r>
+        <w:rPr>
+          <w:color w:val="606060"/>
+        </w:rPr>
+        <w:tab/>
+        <w:t>2015 – 2019</w:t>
+      </w:r>
+    </w:p>
+    <w:p>
+      <w:pPr>
+        <w:keepNext/>
+        <w:spacing w:after="20"/>
+      </w:pPr>
+      <w:r>
+        <w:rPr>
+          <w:i/>
+          <w:color w:val="606060"/>
+        </w:rPr>
+        <w:t>Leuven, Belgium</w:t>
+      </w:r>
+    </w:p>
+    <w:p>
+      <w:pPr>
+        <w:pStyle w:val="ListBullet"/>
+        <w:spacing w:after="30"/>
+        <w:ind w:left="283" w:hanging="198"/>
+      </w:pPr>
+      <w:r>
+        <w:t xml:space="preserve">Contributed to the smart grid use case of the EU </w:t>
+      </w:r>
+      <w:hyperlink r:id="rId18" w:history="1">
+        <w:r>
+          <w:rPr>
+            <w:rStyle w:val="Hyperlink"/>
+            <w:b/>
+          </w:rPr>
+          <w:t>Horizon 2020 HEAT</w:t>
+        </w:r>
+      </w:hyperlink>
+      <w:r>
+        <w:t xml:space="preserve"> project (ICT-644209): privacy-preserving load forecasting in which a licensed third party predicts household energy consumption from homomorphically encrypted smart meter readings.</w:t>
+      </w:r>
+    </w:p>
+    <w:p>
+      <w:pPr>
         <w:spacing w:before="100"/>
         <w:rPr>
           <w:b/>
@@ -1113,7 +1177,7 @@
         </w:rPr>
         <w:t xml:space="preserve">Thesis: </w:t>
       </w:r>
-      <w:hyperlink r:id="rId18" w:history="1">
+      <w:hyperlink r:id="rId19" w:history="1">
         <w:r>
           <w:rPr>
             <w:rStyle w:val="Hyperlink"/>
@@ -1203,7 +1267,7 @@
         <w:spacing w:after="30"/>
         <w:ind w:left="283" w:hanging="198"/>
       </w:pPr>
-      <w:hyperlink r:id="rId19" w:history="1">
+      <w:hyperlink r:id="rId20" w:history="1">
         <w:r>
           <w:rPr>
             <w:rStyle w:val="Hyperlink"/>
@@ -1240,7 +1304,7 @@
         <w:spacing w:after="30"/>
         <w:ind w:left="283" w:hanging="198"/>
       </w:pPr>
-      <w:hyperlink r:id="rId20" w:history="1">
+      <w:hyperlink r:id="rId21" w:history="1">
         <w:r>
           <w:rPr>
             <w:rStyle w:val="Hyperlink"/>
@@ -1264,7 +1328,7 @@
         <w:spacing w:after="30"/>
         <w:ind w:left="283" w:hanging="198"/>
       </w:pPr>
-      <w:hyperlink r:id="rId21" w:history="1">
+      <w:hyperlink r:id="rId22" w:history="1">
         <w:r>
           <w:rPr>
             <w:rStyle w:val="Hyperlink"/>
@@ -1288,7 +1352,7 @@
         <w:spacing w:after="30"/>
         <w:ind w:left="283" w:hanging="198"/>
       </w:pPr>
-      <w:hyperlink r:id="rId22" w:history="1">
+      <w:hyperlink r:id="rId23" w:history="1">
         <w:r>
           <w:rPr>
             <w:rStyle w:val="Hyperlink"/>
@@ -1312,7 +1376,7 @@
         <w:spacing w:after="30"/>
         <w:ind w:left="283" w:hanging="198"/>
       </w:pPr>
-      <w:hyperlink r:id="rId23" w:history="1">
+      <w:hyperlink r:id="rId24" w:history="1">
         <w:r>
           <w:rPr>
             <w:rStyle w:val="Hyperlink"/>
@@ -1336,7 +1400,7 @@
         <w:spacing w:after="30"/>
         <w:ind w:left="283" w:hanging="198"/>
       </w:pPr>
-      <w:hyperlink r:id="rId24" w:history="1">
+      <w:hyperlink r:id="rId25" w:history="1">
         <w:r>
           <w:rPr>
             <w:rStyle w:val="Hyperlink"/>
@@ -1360,7 +1424,7 @@
         <w:spacing w:after="30"/>
         <w:ind w:left="283" w:hanging="198"/>
       </w:pPr>
-      <w:hyperlink r:id="rId25" w:history="1">
+      <w:hyperlink r:id="rId26" w:history="1">
         <w:r>
           <w:rPr>
             <w:rStyle w:val="Hyperlink"/>

</xml_diff>